<commit_message>
Add college-format Synopsis and Project Report docx with MPEC and AKTU logos
</commit_message>
<xml_diff>
--- a/docs/synopsis_EchoSign.docx
+++ b/docs/synopsis_EchoSign.docx
@@ -4,13 +4,7 @@
   <w:body>
     <w:p>
       <w:pPr>
-        <w:spacing w:before="0" w:after="360" w:line="276" w:lineRule="auto"/>
-        <w:jc w:val="left"/>
-      </w:pPr>
-    </w:p>
-    <w:p>
-      <w:pPr>
-        <w:spacing w:before="0" w:after="240" w:line="276" w:lineRule="auto"/>
+        <w:spacing w:before="0" w:after="120" w:line="276" w:lineRule="auto"/>
         <w:jc w:val="center"/>
       </w:pPr>
       <w:r>
@@ -19,30 +13,14 @@
           <w:b/>
           <w:i w:val="0"/>
           <w:color w:val="000000"/>
-          <w:sz w:val="28"/>
+          <w:sz w:val="27"/>
         </w:rPr>
-        <w:t>ECHOSIGN: AN AI-POWERED AMERICAN SIGN LANGUAGE TRANSLATION SYSTEM USING DEEP CONVOLUTIONAL NEURAL NETWORKS AND REAL-TIME SPEECH SYNTHESIS</w:t>
+        <w:t>EchoSign: An Integrated AI Platform for Real-Time American Sign Language Translation, Gesture Evaluation and Speech Synthesis</w:t>
       </w:r>
     </w:p>
     <w:p>
       <w:pPr>
-        <w:spacing w:before="0" w:after="480" w:line="276" w:lineRule="auto"/>
-        <w:jc w:val="center"/>
-      </w:pPr>
-      <w:r>
-        <w:rPr>
-          <w:rFonts w:ascii="Times New Roman" w:hAnsi="Times New Roman"/>
-          <w:b/>
-          <w:i w:val="0"/>
-          <w:color w:val="000000"/>
-          <w:sz w:val="26"/>
-        </w:rPr>
-        <w:t>(ECHOSIGN)</w:t>
-      </w:r>
-    </w:p>
-    <w:p>
-      <w:pPr>
-        <w:spacing w:before="0" w:after="360" w:line="276" w:lineRule="auto"/>
+        <w:spacing w:before="0" w:after="120" w:line="276" w:lineRule="auto"/>
         <w:jc w:val="center"/>
       </w:pPr>
       <w:r>
@@ -51,78 +29,54 @@
           <w:b w:val="0"/>
           <w:i/>
           <w:color w:val="000000"/>
-          <w:sz w:val="22"/>
+          <w:sz w:val="21"/>
         </w:rPr>
         <w:t>Report submitted in partial fulfillment of the requirement for the degree of</w:t>
       </w:r>
     </w:p>
     <w:p>
       <w:pPr>
-        <w:spacing w:before="0" w:after="80" w:line="276" w:lineRule="auto"/>
+        <w:spacing w:before="40" w:after="120"/>
         <w:jc w:val="center"/>
       </w:pPr>
       <w:r>
-        <w:rPr>
-          <w:rFonts w:ascii="Times New Roman" w:hAnsi="Times New Roman"/>
-          <w:b/>
-          <w:i w:val="0"/>
-          <w:color w:val="000000"/>
-          <w:sz w:val="26"/>
-        </w:rPr>
-        <w:t>B. Tech.</w:t>
+        <w:drawing>
+          <wp:inline xmlns:a="http://schemas.openxmlformats.org/drawingml/2006/main" xmlns:pic="http://schemas.openxmlformats.org/drawingml/2006/picture">
+            <wp:extent cx="1645920" cy="851338"/>
+            <wp:docPr id="1" name="Picture 1"/>
+            <wp:cNvGraphicFramePr>
+              <a:graphicFrameLocks noChangeAspect="1"/>
+            </wp:cNvGraphicFramePr>
+            <a:graphic>
+              <a:graphicData uri="http://schemas.openxmlformats.org/drawingml/2006/picture">
+                <pic:pic>
+                  <pic:nvPicPr>
+                    <pic:cNvPr id="0" name="mpec_logo.jpg"/>
+                    <pic:cNvPicPr/>
+                  </pic:nvPicPr>
+                  <pic:blipFill>
+                    <a:blip r:embed="rId9"/>
+                    <a:stretch>
+                      <a:fillRect/>
+                    </a:stretch>
+                  </pic:blipFill>
+                  <pic:spPr>
+                    <a:xfrm>
+                      <a:off x="0" y="0"/>
+                      <a:ext cx="1645920" cy="851338"/>
+                    </a:xfrm>
+                    <a:prstGeom prst="rect"/>
+                  </pic:spPr>
+                </pic:pic>
+              </a:graphicData>
+            </a:graphic>
+          </wp:inline>
+        </w:drawing>
       </w:r>
     </w:p>
     <w:p>
       <w:pPr>
-        <w:spacing w:before="0" w:after="80" w:line="276" w:lineRule="auto"/>
-        <w:jc w:val="center"/>
-      </w:pPr>
-      <w:r>
-        <w:rPr>
-          <w:rFonts w:ascii="Times New Roman" w:hAnsi="Times New Roman"/>
-          <w:b w:val="0"/>
-          <w:i/>
-          <w:color w:val="000000"/>
-          <w:sz w:val="22"/>
-        </w:rPr>
-        <w:t>In</w:t>
-      </w:r>
-    </w:p>
-    <w:p>
-      <w:pPr>
-        <w:spacing w:before="0" w:after="560" w:line="276" w:lineRule="auto"/>
-        <w:jc w:val="center"/>
-      </w:pPr>
-      <w:r>
-        <w:rPr>
-          <w:rFonts w:ascii="Times New Roman" w:hAnsi="Times New Roman"/>
-          <w:b/>
-          <w:i w:val="0"/>
-          <w:color w:val="000000"/>
-          <w:sz w:val="26"/>
-        </w:rPr>
-        <w:t>Computer Science and Engineering</w:t>
-      </w:r>
-    </w:p>
-    <w:p>
-      <w:pPr>
-        <w:spacing w:before="0" w:after="80" w:line="276" w:lineRule="auto"/>
-        <w:jc w:val="center"/>
-      </w:pPr>
-      <w:r>
-        <w:rPr>
-          <w:rFonts w:ascii="Times New Roman" w:hAnsi="Times New Roman"/>
-          <w:b w:val="0"/>
-          <w:i/>
-          <w:color w:val="000000"/>
-          <w:sz w:val="22"/>
-        </w:rPr>
-        <w:t>Under the Supervision of</w:t>
-      </w:r>
-    </w:p>
-    <w:p>
-      <w:pPr>
-        <w:spacing w:before="0" w:after="40" w:line="276" w:lineRule="auto"/>
+        <w:spacing w:before="0" w:after="20" w:line="276" w:lineRule="auto"/>
         <w:jc w:val="center"/>
       </w:pPr>
       <w:r>
@@ -133,23 +87,23 @@
           <w:color w:val="000000"/>
           <w:sz w:val="24"/>
         </w:rPr>
-        <w:t>Ms. Reeta Nagar</w:t>
+        <w:t>B. Tech.</w:t>
       </w:r>
     </w:p>
     <w:p>
       <w:pPr>
-        <w:spacing w:before="0" w:after="560" w:line="276" w:lineRule="auto"/>
+        <w:spacing w:before="0" w:after="20" w:line="276" w:lineRule="auto"/>
         <w:jc w:val="center"/>
       </w:pPr>
       <w:r>
         <w:rPr>
           <w:rFonts w:ascii="Times New Roman" w:hAnsi="Times New Roman"/>
           <w:b w:val="0"/>
-          <w:i w:val="0"/>
+          <w:i/>
           <w:color w:val="000000"/>
-          <w:sz w:val="22"/>
+          <w:sz w:val="20"/>
         </w:rPr>
-        <w:t>Assistant Professor, C.S.E.</w:t>
+        <w:t>In</w:t>
       </w:r>
     </w:p>
     <w:p>
@@ -165,12 +119,44 @@
           <w:color w:val="000000"/>
           <w:sz w:val="24"/>
         </w:rPr>
-        <w:t>Submitted By:</w:t>
+        <w:t>Computer Science and Engineering</w:t>
       </w:r>
     </w:p>
     <w:p>
       <w:pPr>
-        <w:spacing w:before="0" w:after="60" w:line="276" w:lineRule="auto"/>
+        <w:spacing w:before="0" w:after="20" w:line="276" w:lineRule="auto"/>
+        <w:jc w:val="center"/>
+      </w:pPr>
+      <w:r>
+        <w:rPr>
+          <w:rFonts w:ascii="Times New Roman" w:hAnsi="Times New Roman"/>
+          <w:b w:val="0"/>
+          <w:i/>
+          <w:color w:val="000000"/>
+          <w:sz w:val="20"/>
+        </w:rPr>
+        <w:t>Under the Supervision of</w:t>
+      </w:r>
+    </w:p>
+    <w:p>
+      <w:pPr>
+        <w:spacing w:before="0" w:after="20" w:line="276" w:lineRule="auto"/>
+        <w:jc w:val="center"/>
+      </w:pPr>
+      <w:r>
+        <w:rPr>
+          <w:rFonts w:ascii="Times New Roman" w:hAnsi="Times New Roman"/>
+          <w:b/>
+          <w:i w:val="0"/>
+          <w:color w:val="000000"/>
+          <w:sz w:val="23"/>
+        </w:rPr>
+        <w:t>Ms. Rita Nagar</w:t>
+      </w:r>
+    </w:p>
+    <w:p>
+      <w:pPr>
+        <w:spacing w:before="0" w:after="160" w:line="276" w:lineRule="auto"/>
         <w:jc w:val="center"/>
       </w:pPr>
       <w:r>
@@ -179,14 +165,30 @@
           <w:b w:val="0"/>
           <w:i w:val="0"/>
           <w:color w:val="000000"/>
-          <w:sz w:val="22"/>
+          <w:sz w:val="20"/>
         </w:rPr>
-        <w:t>Nidhi Singh (2303491530068)</w:t>
+        <w:t>Assistant Professor, C.S.E.</w:t>
       </w:r>
     </w:p>
     <w:p>
       <w:pPr>
         <w:spacing w:before="0" w:after="60" w:line="276" w:lineRule="auto"/>
+        <w:jc w:val="center"/>
+      </w:pPr>
+      <w:r>
+        <w:rPr>
+          <w:rFonts w:ascii="Times New Roman" w:hAnsi="Times New Roman"/>
+          <w:b/>
+          <w:i w:val="0"/>
+          <w:color w:val="000000"/>
+          <w:sz w:val="22"/>
+        </w:rPr>
+        <w:t>Submitted By:</w:t>
+      </w:r>
+    </w:p>
+    <w:p>
+      <w:pPr>
+        <w:spacing w:before="0" w:after="30" w:line="276" w:lineRule="auto"/>
         <w:jc w:val="center"/>
       </w:pPr>
       <w:r>
@@ -195,14 +197,14 @@
           <w:b w:val="0"/>
           <w:i w:val="0"/>
           <w:color w:val="000000"/>
-          <w:sz w:val="22"/>
+          <w:sz w:val="20"/>
         </w:rPr>
-        <w:t>Yuvraj Singh (2303491530128)</w:t>
+        <w:t>Nidhi Singh (2303491530068)</w:t>
       </w:r>
     </w:p>
     <w:p>
       <w:pPr>
-        <w:spacing w:before="0" w:after="60" w:line="276" w:lineRule="auto"/>
+        <w:spacing w:before="0" w:after="30" w:line="276" w:lineRule="auto"/>
         <w:jc w:val="center"/>
       </w:pPr>
       <w:r>
@@ -211,14 +213,14 @@
           <w:b w:val="0"/>
           <w:i w:val="0"/>
           <w:color w:val="000000"/>
-          <w:sz w:val="22"/>
+          <w:sz w:val="20"/>
         </w:rPr>
-        <w:t>Rohit Kumar (2303491530090)</w:t>
+        <w:t>Yuvraj Singh (2303491530128)</w:t>
       </w:r>
     </w:p>
     <w:p>
       <w:pPr>
-        <w:spacing w:before="0" w:after="60" w:line="276" w:lineRule="auto"/>
+        <w:spacing w:before="0" w:after="30" w:line="276" w:lineRule="auto"/>
         <w:jc w:val="center"/>
       </w:pPr>
       <w:r>
@@ -227,14 +229,14 @@
           <w:b w:val="0"/>
           <w:i w:val="0"/>
           <w:color w:val="000000"/>
-          <w:sz w:val="22"/>
+          <w:sz w:val="20"/>
         </w:rPr>
-        <w:t>Prashant Kumar Singh (2303491530075)</w:t>
+        <w:t>Rohit Kumar (2303491530090)</w:t>
       </w:r>
     </w:p>
     <w:p>
       <w:pPr>
-        <w:spacing w:before="0" w:after="60" w:line="276" w:lineRule="auto"/>
+        <w:spacing w:before="0" w:after="30" w:line="276" w:lineRule="auto"/>
         <w:jc w:val="center"/>
       </w:pPr>
       <w:r>
@@ -243,20 +245,86 @@
           <w:b w:val="0"/>
           <w:i w:val="0"/>
           <w:color w:val="000000"/>
-          <w:sz w:val="22"/>
+          <w:sz w:val="20"/>
+        </w:rPr>
+        <w:t>Prashant Kumar Singh (2303491530075)</w:t>
+      </w:r>
+    </w:p>
+    <w:p>
+      <w:pPr>
+        <w:spacing w:before="0" w:after="30" w:line="276" w:lineRule="auto"/>
+        <w:jc w:val="center"/>
+      </w:pPr>
+      <w:r>
+        <w:rPr>
+          <w:rFonts w:ascii="Times New Roman" w:hAnsi="Times New Roman"/>
+          <w:b w:val="0"/>
+          <w:i w:val="0"/>
+          <w:color w:val="000000"/>
+          <w:sz w:val="20"/>
         </w:rPr>
         <w:t>Komal Goswami (2303491530061)</w:t>
       </w:r>
     </w:p>
     <w:p>
       <w:pPr>
-        <w:spacing w:before="0" w:after="640" w:line="276" w:lineRule="auto"/>
-        <w:jc w:val="left"/>
-      </w:pPr>
+        <w:spacing w:before="80" w:after="120"/>
+        <w:jc w:val="center"/>
+      </w:pPr>
+      <w:r>
+        <w:drawing>
+          <wp:inline xmlns:a="http://schemas.openxmlformats.org/drawingml/2006/main" xmlns:pic="http://schemas.openxmlformats.org/drawingml/2006/picture">
+            <wp:extent cx="1097280" cy="947030"/>
+            <wp:docPr id="2" name="Picture 2"/>
+            <wp:cNvGraphicFramePr>
+              <a:graphicFrameLocks noChangeAspect="1"/>
+            </wp:cNvGraphicFramePr>
+            <a:graphic>
+              <a:graphicData uri="http://schemas.openxmlformats.org/drawingml/2006/picture">
+                <pic:pic>
+                  <pic:nvPicPr>
+                    <pic:cNvPr id="0" name="aktu_logo.jpg"/>
+                    <pic:cNvPicPr/>
+                  </pic:nvPicPr>
+                  <pic:blipFill>
+                    <a:blip r:embed="rId10"/>
+                    <a:stretch>
+                      <a:fillRect/>
+                    </a:stretch>
+                  </pic:blipFill>
+                  <pic:spPr>
+                    <a:xfrm>
+                      <a:off x="0" y="0"/>
+                      <a:ext cx="1097280" cy="947030"/>
+                    </a:xfrm>
+                    <a:prstGeom prst="rect"/>
+                  </pic:spPr>
+                </pic:pic>
+              </a:graphicData>
+            </a:graphic>
+          </wp:inline>
+        </w:drawing>
+      </w:r>
     </w:p>
     <w:p>
       <w:pPr>
-        <w:spacing w:before="0" w:after="80" w:line="276" w:lineRule="auto"/>
+        <w:spacing w:before="0" w:after="20" w:line="276" w:lineRule="auto"/>
+        <w:jc w:val="center"/>
+      </w:pPr>
+      <w:r>
+        <w:rPr>
+          <w:rFonts w:ascii="Times New Roman" w:hAnsi="Times New Roman"/>
+          <w:b/>
+          <w:i w:val="0"/>
+          <w:color w:val="000000"/>
+          <w:sz w:val="22"/>
+        </w:rPr>
+        <w:t>Department of Computer Science &amp; Engineering</w:t>
+      </w:r>
+    </w:p>
+    <w:p>
+      <w:pPr>
+        <w:spacing w:before="0" w:after="20" w:line="276" w:lineRule="auto"/>
         <w:jc w:val="center"/>
       </w:pPr>
       <w:r>
@@ -267,12 +335,28 @@
           <w:color w:val="000000"/>
           <w:sz w:val="24"/>
         </w:rPr>
-        <w:t>Department of Computer Science &amp; Engineering</w:t>
+        <w:t>Maharana Pratap Engineering College, Kanpur</w:t>
       </w:r>
     </w:p>
     <w:p>
       <w:pPr>
-        <w:spacing w:before="0" w:after="80" w:line="276" w:lineRule="auto"/>
+        <w:spacing w:before="0" w:after="20" w:line="276" w:lineRule="auto"/>
+        <w:jc w:val="center"/>
+      </w:pPr>
+      <w:r>
+        <w:rPr>
+          <w:rFonts w:ascii="Times New Roman" w:hAnsi="Times New Roman"/>
+          <w:b w:val="0"/>
+          <w:i w:val="0"/>
+          <w:color w:val="000000"/>
+          <w:sz w:val="21"/>
+        </w:rPr>
+        <w:t>Dr. A.P.J. Abdul Kalam Technical University, Lucknow</w:t>
+      </w:r>
+    </w:p>
+    <w:p>
+      <w:pPr>
+        <w:spacing w:before="0" w:after="0" w:line="276" w:lineRule="auto"/>
         <w:jc w:val="center"/>
       </w:pPr>
       <w:r>
@@ -281,39 +365,7 @@
           <w:b/>
           <w:i w:val="0"/>
           <w:color w:val="000000"/>
-          <w:sz w:val="26"/>
-        </w:rPr>
-        <w:t>Maharana Pratap Engineering College, Kanpur</w:t>
-      </w:r>
-    </w:p>
-    <w:p>
-      <w:pPr>
-        <w:spacing w:before="0" w:after="80" w:line="276" w:lineRule="auto"/>
-        <w:jc w:val="center"/>
-      </w:pPr>
-      <w:r>
-        <w:rPr>
-          <w:rFonts w:ascii="Times New Roman" w:hAnsi="Times New Roman"/>
-          <w:b w:val="0"/>
-          <w:i w:val="0"/>
-          <w:color w:val="000000"/>
-          <w:sz w:val="24"/>
-        </w:rPr>
-        <w:t>Dr. A.P.J. Abdul Kalam Technical University, Lucknow</w:t>
-      </w:r>
-    </w:p>
-    <w:p>
-      <w:pPr>
-        <w:spacing w:before="0" w:after="0" w:line="276" w:lineRule="auto"/>
-        <w:jc w:val="center"/>
-      </w:pPr>
-      <w:r>
-        <w:rPr>
-          <w:rFonts w:ascii="Times New Roman" w:hAnsi="Times New Roman"/>
-          <w:b/>
-          <w:i w:val="0"/>
-          <w:color w:val="000000"/>
-          <w:sz w:val="22"/>
+          <w:sz w:val="21"/>
         </w:rPr>
         <w:t>Session: 2026-27</w:t>
       </w:r>
@@ -352,7 +404,7 @@
           <w:color w:val="000000"/>
           <w:sz w:val="22"/>
         </w:rPr>
-        <w:t>This is to certify that the Synopsis Report entitled “EchoSign: An AI-Powered American Sign Language Translation System Using Deep Convolutional Neural Networks and Real-Time Speech Synthesis”, which is submitted in partial fulfilment of the requirement for the award of the degree of B.Tech. in Computer Science and Engineering to MPEC Kanpur, Dr. A.P.J. Abdul Kalam Technical University, Lucknow, comprises only original work and studies carried out by the students themselves. The matter embodied in this synopsis has not been submitted for the award of any other degree.</w:t>
+        <w:t>This is to certify that the Synopsis Report entitled “EchoSign: An AI-Powered American Sign Language Translation System Using Deep Convolutional Neural Networks and Real-Time Speech Synthesis”, which is submitted in partial fulfilment of the requirement for the award of the degree of B.Tech. in Computer Science and Engineering to MPEC Kanpur, Dr. A.P.J. Abdul Kalam Technical University, Lucknow, comprises only original work and studies carried out by the students themselves. The matter embodied in this report has not been submitted for the award of any other degree.</w:t>
       </w:r>
     </w:p>
     <w:p>
@@ -467,7 +519,7 @@
               <w:rPr>
                 <w:sz w:val="22"/>
               </w:rPr>
-              <w:t>Ms. Reeta Nagar</w:t>
+              <w:t>Ms. Rita Nagar</w:t>
               <w:br/>
               <w:t>Project Guide</w:t>
               <w:br/>
@@ -7169,7 +7221,7 @@
     </w:p>
     <w:sectPr>
       <w:pgSz w:w="12240" w:h="15840"/>
-      <w:pgMar w:top="1440" w:right="1440" w:bottom="1440" w:left="1440" w:header="720" w:footer="720" w:gutter="0"/>
+      <w:pgMar w:top="1152" w:right="1440" w:bottom="1152" w:left="1440" w:header="720" w:footer="720" w:gutter="0"/>
       <w:cols w:space="720"/>
       <w:docGrid w:linePitch="360"/>
     </w:sectPr>

</xml_diff>